<commit_message>
Update documentation for GSOO Step Change re-basing
Reflect the 2026-06-29 re-basing of demand onto the AEMO 2026 GSOO
Step Change central case across README, TECHNICAL_DOCS and the Word doc:
- Demand re-based on GSOO trajectories (ResComm/NEM/industrial/LNG),
  empirical GBB daily shapes preserved; replaces arbitrary per-node rates
- Document the build pipeline + one-button Regenerate All Data workflow
- Note generated data is gitignored / rebuilt from source
- Correct solver reference (HiGHS -> CBC); drop deleted generate_data_2050.py
- Regenerate Gas_Market_Model_Documentation.docx

Co-Authored-By: Claude Opus 4.8 <noreply@anthropic.com>
</commit_message>
<xml_diff>
--- a/Gas_Market_Model_Documentation.docx
+++ b/Gas_Market_Model_Documentation.docx
@@ -93,12 +93,12 @@
         <w:pStyle w:val="Heading2"/>
       </w:pPr>
       <w:r>
-        <w:t>3.1 Demand Traces (Step Change Scenario)</w:t>
+        <w:t>3.1 Demand Traces (Step Change Central Case)</w:t>
       </w:r>
     </w:p>
     <w:p>
       <w:r>
-        <w:t>Annual demand profiles are based on the AEMO 2026 GSOO Step Change scenario. In 2026, Queensland LNG export demand is calibrated to ~3,650 TJ/day (~1,250 PJ/year). Long-term annual decline rates applied include:</w:t>
+        <w:t>The model's central case is the AEMO 2026 GSOO Step Change scenario. Rather than applying arbitrary per-node growth rates, each demand sector is re-based directly onto its GSOO Step Change annual trajectory while the empirical daily profile shape from Gas Bulletin Board (GBB) actuals is preserved (shape correlation 1.0; only the annual level is scaled). GSOO indices are applied relative to 2026 and clamped to the 2026-2045 GSOO horizon, then held flat to 2050. The Winter, LNG and ADGSM scenario levers layer multiplicatively on top of this central case. Queensland LNG export demand is calibrated to ~3,650 TJ/day (~1,250 PJ/year) in 2026.</w:t>
       </w:r>
     </w:p>
     <w:tbl>
@@ -118,7 +118,7 @@
           </w:tcPr>
           <w:p>
             <w:r>
-              <w:t>Node / Region</w:t>
+              <w:t>Sector / Node</w:t>
             </w:r>
           </w:p>
         </w:tc>
@@ -128,7 +128,7 @@
           </w:tcPr>
           <w:p>
             <w:r>
-              <w:t>Growth/Decline Rate</w:t>
+              <w:t>GSOO Step Change Driver</w:t>
             </w:r>
           </w:p>
         </w:tc>
@@ -150,7 +150,7 @@
           </w:tcPr>
           <w:p>
             <w:r>
-              <w:t>Melbourne</w:t>
+              <w:t>City nodes (Sydney, Melbourne, Adelaide, Brisbane)</w:t>
             </w:r>
           </w:p>
         </w:tc>
@@ -160,7 +160,7 @@
           </w:tcPr>
           <w:p>
             <w:r>
-              <w:t>-4.0% p.a.</w:t>
+              <w:t>GSOO ResComm trajectory (Fig. 17)</w:t>
             </w:r>
           </w:p>
         </w:tc>
@@ -170,7 +170,7 @@
           </w:tcPr>
           <w:p>
             <w:r>
-              <w:t>Victorian Gas Substitution Roadmap</w:t>
+              <w:t>City-gate distribution demand; electrification-driven decline</w:t>
             </w:r>
           </w:p>
         </w:tc>
@@ -182,7 +182,7 @@
           </w:tcPr>
           <w:p>
             <w:r>
-              <w:t>Sydney</w:t>
+              <w:t>Gas-powered generation (GPG)</w:t>
             </w:r>
           </w:p>
         </w:tc>
@@ -192,7 +192,7 @@
           </w:tcPr>
           <w:p>
             <w:r>
-              <w:t>-3.0% p.a.</w:t>
+              <w:t>GSOO NEM trajectory + regional peaks</w:t>
             </w:r>
           </w:p>
         </w:tc>
@@ -202,7 +202,7 @@
           </w:tcPr>
           <w:p>
             <w:r>
-              <w:t>NSW residential electrification</w:t>
+              <w:t>Annual level anchored to NEM GPG; winter-peaking from regional summer/winter peaks</w:t>
             </w:r>
           </w:p>
         </w:tc>
@@ -214,7 +214,7 @@
           </w:tcPr>
           <w:p>
             <w:r>
-              <w:t>Brisbane</w:t>
+              <w:t>Large industrial</w:t>
             </w:r>
           </w:p>
         </w:tc>
@@ -224,7 +224,7 @@
           </w:tcPr>
           <w:p>
             <w:r>
-              <w:t>-1.0% p.a.</w:t>
+              <w:t>GSOO industrial trajectory (year index)</w:t>
             </w:r>
           </w:p>
         </w:tc>
@@ -234,7 +234,7 @@
           </w:tcPr>
           <w:p>
             <w:r>
-              <w:t>Persistent industrial baseload</w:t>
+              <w:t>Indexed on empirical BBLARGE levels (a subset of whole-sector industrial); Yarwun reclassified GPG -&gt; industrial</w:t>
             </w:r>
           </w:p>
         </w:tc>
@@ -246,7 +246,7 @@
           </w:tcPr>
           <w:p>
             <w:r>
-              <w:t>LNG Export Cluster</w:t>
+              <w:t>LNG cluster (APLNG, GLNG, QCLNG)</w:t>
             </w:r>
           </w:p>
         </w:tc>
@@ -256,7 +256,7 @@
           </w:tcPr>
           <w:p>
             <w:r>
-              <w:t>3,650 TJ/day</w:t>
+              <w:t>GSOO LNG trajectory (Fig. 19)</w:t>
             </w:r>
           </w:p>
         </w:tc>
@@ -266,12 +266,18 @@
           </w:tcPr>
           <w:p>
             <w:r>
-              <w:t>AEMO 2026 GSOO Benchmark</w:t>
+              <w:t>~3,650 TJ/day in 2026; replaces previous flat assumption</w:t>
             </w:r>
           </w:p>
         </w:tc>
       </w:tr>
     </w:tbl>
+    <w:p>
+      <w:r>
+        <w:br/>
+        <w:t>Derived demand data is rebuilt from source by the "Regenerate All Data" button (src/regenerate_data.py), which runs the build pipeline in dependency order: build_curtailable_demand -&gt; build_gsoo_stepchange -&gt; build_gpg_demand_gsoo -&gt; build_industrial_demand_gsoo -&gt; build_demand_gsoo. Only source inputs (GBB actuals, GSOO workbooks, configs) are committed; generated files are rebuilt locally.</w:t>
+      </w:r>
+    </w:p>
     <w:p>
       <w:r>
         <w:br/>

</xml_diff>